<commit_message>
final submit of all files
</commit_message>
<xml_diff>
--- a/Internet of things/Case Study IOT.docx
+++ b/Internet of things/Case Study IOT.docx
@@ -434,7 +434,14 @@
           <w:szCs w:val="32"/>
         </w:rPr>
         <w:lastRenderedPageBreak/>
-        <w:t>Table of Contents</w:t>
+        <w:t xml:space="preserve">Table of </w:t>
+      </w:r>
+      <w:r>
+        <w:rPr>
+          <w:sz w:val="32"/>
+          <w:szCs w:val="32"/>
+        </w:rPr>
+        <w:t>Contents</w:t>
       </w:r>
     </w:p>
     <w:p>
@@ -850,7 +857,23 @@
           <w:sz w:val="22"/>
           <w:szCs w:val="22"/>
         </w:rPr>
-        <w:t>The Internet of Things (IoT) is a network of physical devices, sensors, and actuators embedded with processing power and connectivity, allowing them to collect, exchange, and act on data with minimal human intervention. Over the past decade IoT has moved from research concept to foundational technology across healthcare, agriculture, manufacturing, and finance. One of its most security-sensitive applications lies in banking, specifically at Automated Teller Machines (ATMs), which handle billions of unattended cash transactions worldwide every year.</w:t>
+        <w:t xml:space="preserve">The </w:t>
+      </w:r>
+      <w:r>
+        <w:rPr>
+          <w:rFonts w:ascii="Calibri" w:eastAsia="Calibri" w:hAnsi="Calibri" w:cs="Calibri"/>
+          <w:sz w:val="22"/>
+          <w:szCs w:val="22"/>
+        </w:rPr>
+        <w:t>Internet of Things (IoT) is a network of physical devices, sensors, and actuators embedded with processing power and connectivity, allowing them to collect, exchange, and act on data with minimal human intervention. Over the past decade IoT has moved from research concept to foundational technology across healthcare, agriculture, manufacturing, and finance. One of its most security-sensitive applications lies in banking, specifically at Automated Teller Machines (ATMs), which handle billions of unattended c</w:t>
+      </w:r>
+      <w:r>
+        <w:rPr>
+          <w:rFonts w:ascii="Calibri" w:eastAsia="Calibri" w:hAnsi="Calibri" w:cs="Calibri"/>
+          <w:sz w:val="22"/>
+          <w:szCs w:val="22"/>
+        </w:rPr>
+        <w:t>ash transactions worldwide every year.</w:t>
       </w:r>
     </w:p>
     <w:p>
@@ -912,7 +935,15 @@
           <w:sz w:val="22"/>
           <w:szCs w:val="22"/>
         </w:rPr>
-        <w:t>stolen or cloned cards, shoulder-surfed PINs, cardholders forgetting their card keeps causing losses despite decades of password-based security. Banking is now shifting toward multi-factor and biometric authentication, and IoT-enabled edge AI makes real-time on-site verification feasible rather than relying only on after-the-fact CCTV review. This topic is important because it merges IoT, computer vision, and cloud computing into one practical solution, making it a strong case study for the architecture, protocol, and security concepts covered in this course.</w:t>
+        <w:t xml:space="preserve">stolen or cloned cards, shoulder-surfed PINs, cardholders forgetting their card keeps causing losses despite decades of password-based security. Banking is now shifting toward multi-factor and biometric authentication, and IoT-enabled edge AI makes real-time on-site verification feasible rather than relying only on after-the-fact CCTV review. This topic is important because it merges IoT, computer vision, and cloud computing into one practical solution, making it a strong case study for the architecture, </w:t>
+      </w:r>
+      <w:r>
+        <w:rPr>
+          <w:rFonts w:ascii="Calibri" w:eastAsia="Calibri" w:hAnsi="Calibri" w:cs="Calibri"/>
+          <w:sz w:val="22"/>
+          <w:szCs w:val="22"/>
+        </w:rPr>
+        <w:t>protocol, and security concepts covered in this course.</w:t>
       </w:r>
     </w:p>
     <w:p>
@@ -1041,7 +1072,15 @@
           <w:sz w:val="22"/>
           <w:szCs w:val="22"/>
         </w:rPr>
-        <w:t>The Smart ATM Security System solves this by adding a real-time, IoT-connected face verification layer at the point of transaction, comparing a live image against a continuously updated cardholder record and raising an alarm on mismatch before cash is dispensed. This matters because ATM fraud causes direct financial loss and erodes trust in banking infrastructure at scale. Beneficiaries include cardholders (protected from losses), banks (reduced fraud liability), and law enforcement (automated flagging instead of manual video review).</w:t>
+        <w:t>The Smart ATM Security System solves this by adding a real-time, IoT-connected face verification layer at the point of transaction, comparing a live image against a continuously updated cardholder record and raising an alarm on mismatch before cash is dispensed. This matters because ATM fraud causes direct financial loss and erodes trust in banking infrastructure at scale. Beneficiaries include cardholders (protected from losses), banks (reduced fraud liability), and law enforcement (automated flagging inst</w:t>
+      </w:r>
+      <w:r>
+        <w:rPr>
+          <w:rFonts w:ascii="Calibri" w:eastAsia="Calibri" w:hAnsi="Calibri" w:cs="Calibri"/>
+          <w:sz w:val="22"/>
+          <w:szCs w:val="22"/>
+        </w:rPr>
+        <w:t>ead of manual video review).</w:t>
       </w:r>
     </w:p>
     <w:p>
@@ -1104,7 +1143,15 @@
           <w:sz w:val="22"/>
           <w:szCs w:val="22"/>
         </w:rPr>
-        <w:t xml:space="preserve"> An IR proximity sensor at the card slot detects insertion and triggers the camera to capture a live image. A Raspberry Pi 4 acts as the edge node: it runs preprocessing (noise filtering, histogram equalization for variable kiosk lighting), a cascaded CNN for face detection, and a DeepID2-based embedding model for verification the same detect-then-verify pipeline used in prior ATM research [2], on modern edge hardware. On mismatch, the Pi drives a relay/buzzer to sound a local alarm and can hold the transaction.</w:t>
+        <w:t xml:space="preserve"> An IR proximity sensor at the card slot detects insertion and triggers the camera to capture a live image. A Raspberry Pi 4 acts as the edge node: it runs preprocessing (noise filtering, histogram equalization for variable kiosk lighting), a cascaded CNN for face detection, and a DeepID2-based embedding model for verification the same detect-then-verify pipeline used in prior ATM research [2], on modern edge hardware. On mismatch, the Pi drives a relay/buzzer to sound a local alarm and can hold the transac</w:t>
+      </w:r>
+      <w:r>
+        <w:rPr>
+          <w:rFonts w:ascii="Calibri" w:eastAsia="Calibri" w:hAnsi="Calibri" w:cs="Calibri"/>
+          <w:sz w:val="22"/>
+          <w:szCs w:val="22"/>
+        </w:rPr>
+        <w:t>tion.</w:t>
       </w:r>
     </w:p>
     <w:p>
@@ -1239,7 +1286,15 @@
           <w:sz w:val="22"/>
           <w:szCs w:val="22"/>
         </w:rPr>
-        <w:t>This separation is deliberate: the device layer keeps basic detection fast and network-independent; the network layer moves only minimal data; the cloud layer centralizes storage, auditing, and monitoring across the whole ATM network rather than each machine operating in isolation.</w:t>
+        <w:t xml:space="preserve">This separation is deliberate: the device layer keeps basic detection fast and network-independent; the network layer moves only </w:t>
+      </w:r>
+      <w:r>
+        <w:rPr>
+          <w:rFonts w:ascii="Calibri" w:eastAsia="Calibri" w:hAnsi="Calibri" w:cs="Calibri"/>
+          <w:sz w:val="22"/>
+          <w:szCs w:val="22"/>
+        </w:rPr>
+        <w:t>minimal data; the cloud layer centralizes storage, auditing, and monitoring across the whole ATM network rather than each machine operating in isolation.</w:t>
       </w:r>
     </w:p>
     <w:p>
@@ -2219,12 +2274,6 @@
         <w:gridCol w:w="2250"/>
       </w:tblGrid>
       <w:tr>
-        <w:tblPrEx>
-          <w:tblCellMar>
-            <w:top w:w="0" w:type="dxa"/>
-            <w:bottom w:w="0" w:type="dxa"/>
-          </w:tblCellMar>
-        </w:tblPrEx>
         <w:tc>
           <w:tcPr>
             <w:tcW w:w="2250" w:type="dxa"/>
@@ -2331,12 +2380,6 @@
         </w:tc>
       </w:tr>
       <w:tr>
-        <w:tblPrEx>
-          <w:tblCellMar>
-            <w:top w:w="0" w:type="dxa"/>
-            <w:bottom w:w="0" w:type="dxa"/>
-          </w:tblCellMar>
-        </w:tblPrEx>
         <w:tc>
           <w:tcPr>
             <w:tcW w:w="2250" w:type="dxa"/>
@@ -2431,12 +2474,6 @@
         </w:tc>
       </w:tr>
       <w:tr>
-        <w:tblPrEx>
-          <w:tblCellMar>
-            <w:top w:w="0" w:type="dxa"/>
-            <w:bottom w:w="0" w:type="dxa"/>
-          </w:tblCellMar>
-        </w:tblPrEx>
         <w:tc>
           <w:tcPr>
             <w:tcW w:w="2250" w:type="dxa"/>
@@ -2531,12 +2568,6 @@
         </w:tc>
       </w:tr>
       <w:tr>
-        <w:tblPrEx>
-          <w:tblCellMar>
-            <w:top w:w="0" w:type="dxa"/>
-            <w:bottom w:w="0" w:type="dxa"/>
-          </w:tblCellMar>
-        </w:tblPrEx>
         <w:tc>
           <w:tcPr>
             <w:tcW w:w="2250" w:type="dxa"/>
@@ -2631,12 +2662,6 @@
         </w:tc>
       </w:tr>
       <w:tr>
-        <w:tblPrEx>
-          <w:tblCellMar>
-            <w:top w:w="0" w:type="dxa"/>
-            <w:bottom w:w="0" w:type="dxa"/>
-          </w:tblCellMar>
-        </w:tblPrEx>
         <w:tc>
           <w:tcPr>
             <w:tcW w:w="2250" w:type="dxa"/>
@@ -2725,7 +2750,16 @@
                 <w:sz w:val="19"/>
                 <w:szCs w:val="19"/>
               </w:rPr>
-              <w:t>Good for constrained swarms</w:t>
+              <w:t xml:space="preserve">Good for </w:t>
+            </w:r>
+            <w:r>
+              <w:rPr>
+                <w:rFonts w:ascii="Calibri" w:eastAsia="Calibri" w:hAnsi="Calibri" w:cs="Calibri"/>
+                <w:color w:val="000000"/>
+                <w:sz w:val="19"/>
+                <w:szCs w:val="19"/>
+              </w:rPr>
+              <w:t>constrained swarms</w:t>
             </w:r>
           </w:p>
         </w:tc>
@@ -2747,7 +2781,15 @@
           <w:sz w:val="22"/>
           <w:szCs w:val="22"/>
         </w:rPr>
-        <w:t>REST is used for verification calls needing a clear request-response guarantee, while MQTT handles alarm broadcast, simultaneously notifying the dashboard, on-site guard terminal, and mobile app the instant a mismatch occurs, faster than polling [7].</w:t>
+        <w:t xml:space="preserve">REST is used for verification calls needing a clear request-response guarantee, while MQTT handles alarm broadcast, simultaneously notifying the dashboard, on-site guard terminal, and mobile app the instant a mismatch occurs, </w:t>
+      </w:r>
+      <w:r>
+        <w:rPr>
+          <w:rFonts w:ascii="Calibri" w:eastAsia="Calibri" w:hAnsi="Calibri" w:cs="Calibri"/>
+          <w:sz w:val="22"/>
+          <w:szCs w:val="22"/>
+        </w:rPr>
+        <w:t>faster than polling [7].</w:t>
       </w:r>
     </w:p>
     <w:p>
@@ -2770,7 +2812,15 @@
           <w:sz w:val="22"/>
           <w:szCs w:val="22"/>
         </w:rPr>
-        <w:t>On card insertion, the IR sensor triggers the camera. The frame is denoised and contrast-corrected, then passed to the detector, which locates the largest face (assumed the user). This face is verified against the cardholder's stored embedding via DeepID2, producing a similarity score against a threshold. The match result is sent via REST to the EC2 backend, which logs the transaction, updates the face record on success, and returns an allow/deny decision.</w:t>
+        <w:t xml:space="preserve">On card insertion, the IR sensor triggers the camera. The frame is denoised and contrast-corrected, then passed to the detector, which locates the largest face (assumed the user). This face is verified </w:t>
+      </w:r>
+      <w:r>
+        <w:rPr>
+          <w:rFonts w:ascii="Calibri" w:eastAsia="Calibri" w:hAnsi="Calibri" w:cs="Calibri"/>
+          <w:sz w:val="22"/>
+          <w:szCs w:val="22"/>
+        </w:rPr>
+        <w:t>against the cardholder's stored embedding via DeepID2, producing a similarity score against a threshold. The match result is sent via REST to the EC2 backend, which logs the transaction, updates the face record on success, and returns an allow/deny decision.</w:t>
       </w:r>
     </w:p>
     <w:p>
@@ -3587,7 +3637,15 @@
           <w:sz w:val="22"/>
           <w:szCs w:val="22"/>
         </w:rPr>
-        <w:t xml:space="preserve"> requires the backend to handle many concurrent requests without added latency; and </w:t>
+        <w:t xml:space="preserve"> requires th</w:t>
+      </w:r>
+      <w:r>
+        <w:rPr>
+          <w:rFonts w:ascii="Calibri" w:eastAsia="Calibri" w:hAnsi="Calibri" w:cs="Calibri"/>
+          <w:sz w:val="22"/>
+          <w:szCs w:val="22"/>
+        </w:rPr>
+        <w:t xml:space="preserve">e backend to handle many concurrent requests without added latency; and </w:t>
       </w:r>
       <w:r>
         <w:rPr>
@@ -3745,7 +3803,10 @@
         <w:spacing w:before="400"/>
       </w:pPr>
       <w:r>
-        <w:t>13. Personal Reflection</w:t>
+        <w:t xml:space="preserve">13. </w:t>
+      </w:r>
+      <w:r>
+        <w:t>Personal Reflection</w:t>
       </w:r>
     </w:p>
     <w:p>
@@ -3759,7 +3820,15 @@
           <w:sz w:val="22"/>
           <w:szCs w:val="22"/>
         </w:rPr>
-        <w:t>Working through this case study deepened my understanding of how the layered IoT architecture taught in this course applies to a genuinely high-stakes security problem rather than a purely academic sensor demo. Studying the ATM face-recognition patent alongside real IoT security literature showed me that even a computer-vision-heavy system still depends on the same networking and cloud fundamentals — REST, MQTT, cloud hosting — practiced in the labs. Mapping each lab to a specific part of this system made the labs feel like reusable building blocks rather than isolated exercises. This strengthened my system-level thinking, protocol selection based on tradeoffs rather than default choices, and my ability to structure a security analysis around concrete threats and mitigations. It has also increased my interest in edge AI and computer-vision security as a direction for further study.</w:t>
+        <w:t>Working through this case study deepened my understanding of how the layered IoT architecture taught in this course applies to a genuinely high-stakes security problem rather than a purely academic sensor demo. Studying the ATM face-recognition patent alongside real IoT security literature showed me that even a computer-vision-heavy system still depends on the same networking and cloud fundamentals — REST, MQTT, cloud hosting — practiced in the labs. Mapping each lab to a specific part of this system made t</w:t>
+      </w:r>
+      <w:r>
+        <w:rPr>
+          <w:rFonts w:ascii="Calibri" w:eastAsia="Calibri" w:hAnsi="Calibri" w:cs="Calibri"/>
+          <w:sz w:val="22"/>
+          <w:szCs w:val="22"/>
+        </w:rPr>
+        <w:t>he labs feel like reusable building blocks rather than isolated exercises. This strengthened my system-level thinking, protocol selection based on tradeoffs rather than default choices, and my ability to structure a security analysis around concrete threats and mitigations. It has also increased my interest in edge AI and computer-vision security as a direction for further study.</w:t>
       </w:r>
     </w:p>
     <w:p>
@@ -3787,7 +3856,15 @@
           <w:sz w:val="22"/>
           <w:szCs w:val="22"/>
         </w:rPr>
-        <w:t>This case study analyzed a Smart ATM Security System that strengthens card-and-PIN authentication with real-time IoT-connected face verification. Combining an edge-processing device layer, a network layer (REST for verification, MQTT for alerts), and a cloud layer (EC2, PostgreSQL, dashboard) closes a long-standing gap: verifying the user is truly the cardholder before cash is dispensed, rather than only recording evidence afterward. This is achievable with low-cost, widely available hardware and standard IoT protocols, provided preprocessing, database freshness, and end-to-end security are properly engineered. As IoT, edge AI, and cloud infrastructure mature, systems like this are likely to become a standard layer of defense across banking, reducing card fraud while giving security teams real-time, actionable visibility instead of after-the-fact review.</w:t>
+        <w:t>This case study analyzed a Smart ATM Security System that strengthens card-and-PIN authentication with real-time IoT-connected face verification. Combining an edge-processing device layer, a network layer (REST for verification, MQTT for alerts), and a cloud layer (EC2, PostgreSQL, dashboard) closes a long-standing gap: verifying the user is truly the cardholder before cash is dispensed, rather than only recording evidence afterward. This is achievable with low-cost, widely available hardware and standard I</w:t>
+      </w:r>
+      <w:r>
+        <w:rPr>
+          <w:rFonts w:ascii="Calibri" w:eastAsia="Calibri" w:hAnsi="Calibri" w:cs="Calibri"/>
+          <w:sz w:val="22"/>
+          <w:szCs w:val="22"/>
+        </w:rPr>
+        <w:t>oT protocols, provided preprocessing, database freshness, and end-to-end security are properly engineered. As IoT, edge AI, and cloud infrastructure mature, systems like this are likely to become a standard layer of defense across banking, reducing card fraud while giving security teams real-time, actionable visibility instead of after-the-fact review.</w:t>
       </w:r>
     </w:p>
     <w:p>

</xml_diff>